<commit_message>
Update diagram titles to Aurum branding in Business_Analysis_Document.docx
Co-authored-by: deyuranm123 <70724966+deyuranm123@users.noreply.github.com>
</commit_message>
<xml_diff>
--- a/Business_Analysis_Document.docx
+++ b/Business_Analysis_Document.docx
@@ -134,9 +134,6 @@
         <w:pStyle w:val="Heading1"/>
       </w:pPr>
       <w:r>
-        <w:rPr>
-          <w:color w:val="1F3864"/>
-        </w:rPr>
         <w:t>Table of Contents</w:t>
       </w:r>
     </w:p>
@@ -271,9 +268,6 @@
         <w:pStyle w:val="Heading1"/>
       </w:pPr>
       <w:r>
-        <w:rPr>
-          <w:color w:val="1F3864"/>
-        </w:rPr>
         <w:t>1. Executive Summary</w:t>
       </w:r>
     </w:p>
@@ -302,9 +296,6 @@
         <w:pStyle w:val="Heading1"/>
       </w:pPr>
       <w:r>
-        <w:rPr>
-          <w:color w:val="1F3864"/>
-        </w:rPr>
         <w:t>2. Project Background &amp; Context</w:t>
       </w:r>
     </w:p>
@@ -584,9 +575,6 @@
         <w:pStyle w:val="Heading1"/>
       </w:pPr>
       <w:r>
-        <w:rPr>
-          <w:color w:val="1F3864"/>
-        </w:rPr>
         <w:t>3. Current State Analysis</w:t>
       </w:r>
     </w:p>
@@ -653,7 +641,7 @@
         <w:jc w:val="center"/>
       </w:pPr>
       <w:r>
-        <w:t>Figure 1 – Current State: End-users connect via RDP to the application server, which communicates with back-end systems directly.</w:t>
+        <w:t>Figure 1 – Aurum Current State: End-users connect via RDP to the application server, which communicates with back-end systems directly.</w:t>
       </w:r>
     </w:p>
     <w:p>
@@ -706,9 +694,6 @@
         <w:pStyle w:val="Heading1"/>
       </w:pPr>
       <w:r>
-        <w:rPr>
-          <w:color w:val="1F3864"/>
-        </w:rPr>
         <w:t>4. Future State Architecture</w:t>
       </w:r>
     </w:p>
@@ -780,7 +765,7 @@
         <w:jc w:val="center"/>
       </w:pPr>
       <w:r>
-        <w:t>Figure 2 – Future State: Remote users connect through Palo Alto Prisma SASE, then via RDP (Option 2) or VDI (Option 3) to the application server.</w:t>
+        <w:t>Figure 2 – Aurum Future State: Remote users connect through Palo Alto Prisma SASE, then via RDP (Option 2) or VDI (Option 3) to the application server.</w:t>
       </w:r>
     </w:p>
     <w:p>
@@ -854,9 +839,6 @@
         <w:pStyle w:val="Heading1"/>
       </w:pPr>
       <w:r>
-        <w:rPr>
-          <w:color w:val="1F3864"/>
-        </w:rPr>
         <w:t>5. Options Analysis</w:t>
       </w:r>
     </w:p>
@@ -913,7 +895,7 @@
         <w:jc w:val="center"/>
       </w:pPr>
       <w:r>
-        <w:t>Figure 4 – Options Comparison: scored 1 (low) to 5 (high) across key criteria.</w:t>
+        <w:t>Figure 4 – Aurum Options Comparison: scored 1 (low) to 5 (high) across key criteria.</w:t>
       </w:r>
     </w:p>
     <w:p>
@@ -1356,9 +1338,6 @@
         <w:pStyle w:val="Heading1"/>
       </w:pPr>
       <w:r>
-        <w:rPr>
-          <w:color w:val="1F3864"/>
-        </w:rPr>
         <w:t>6. Recommendations</w:t>
       </w:r>
     </w:p>
@@ -1497,7 +1476,7 @@
           </w:tcPr>
           <w:p>
             <w:r>
-              <w:t>Option 2 offers the best balance of performance, cost, and implementation speed for a 5–10 user deployment. The existing UAT environment already uses this model and users are trained on it.</w:t>
+              <w:t>Option 2 offers the best balance of performance, cost, and implementation speed for a 5–10 user deployment.</w:t>
             </w:r>
           </w:p>
         </w:tc>
@@ -1546,7 +1525,7 @@
           </w:tcPr>
           <w:p>
             <w:r>
-              <w:t>Marco Van Der Rheede to convene a session with InfoSec, Server Core, and Jean-Pierre Lishman to confirm policy compliance of Option 2. If InfoSec mandates Option 3, a revised cost/timeline estimate must be produced.</w:t>
+              <w:t>Marco Van Der Rheede to convene a session with InfoSec, Server Core, and Jean-Pierre Lishman to confirm policy compliance.</w:t>
             </w:r>
           </w:p>
         </w:tc>
@@ -1595,7 +1574,7 @@
           </w:tcPr>
           <w:p>
             <w:r>
-              <w:t>Reduce end-user network exposure by routing all data-fetch jobs through the Aurum Scheduler on the application server, rather than interactive user sessions.</w:t>
+              <w:t>Reduce end-user network exposure by routing all data-fetch jobs through the Aurum Scheduler.</w:t>
             </w:r>
           </w:p>
         </w:tc>
@@ -1644,7 +1623,7 @@
           </w:tcPr>
           <w:p>
             <w:r>
-              <w:t>Apply least-privilege controls so that RDP users can only access the specific folder required for licence and product configuration files.</w:t>
+              <w:t>Apply least-privilege controls so RDP users can only access the specific folder required.</w:t>
             </w:r>
           </w:p>
         </w:tc>
@@ -1693,7 +1672,7 @@
           </w:tcPr>
           <w:p>
             <w:r>
-              <w:t>Ensure all user activity on the application server is logged and retained in compliance with SOX and ISO requirements.</w:t>
+              <w:t>Ensure all user activity is logged and retained in compliance with SOX and ISO requirements.</w:t>
             </w:r>
           </w:p>
         </w:tc>
@@ -1710,9 +1689,6 @@
         <w:pStyle w:val="Heading1"/>
       </w:pPr>
       <w:r>
-        <w:rPr>
-          <w:color w:val="1F3864"/>
-        </w:rPr>
         <w:t>7. Risk Register</w:t>
       </w:r>
     </w:p>
@@ -2237,9 +2213,6 @@
         <w:pStyle w:val="Heading1"/>
       </w:pPr>
       <w:r>
-        <w:rPr>
-          <w:color w:val="1F3864"/>
-        </w:rPr>
         <w:t>8. Action Items &amp; Next Steps</w:t>
       </w:r>
     </w:p>
@@ -2814,9 +2787,6 @@
         <w:pStyle w:val="Heading1"/>
       </w:pPr>
       <w:r>
-        <w:rPr>
-          <w:color w:val="1F3864"/>
-        </w:rPr>
         <w:t>9. Glossary</w:t>
       </w:r>
     </w:p>
@@ -2966,7 +2936,7 @@
           </w:tcPr>
           <w:p>
             <w:r>
-              <w:t>A dedicated, hardened server through which administrators or users connect to access other systems, reducing direct exposure of back-end infrastructure.</w:t>
+              <w:t>A dedicated, hardened server through which users connect to access other systems, reducing direct exposure of back-end infrastructure.</w:t>
             </w:r>
           </w:p>
         </w:tc>
@@ -3116,7 +3086,7 @@
           </w:tcPr>
           <w:p>
             <w:r>
-              <w:t>International information security management standard used by the organisation to govern IT security controls.</w:t>
+              <w:t>International information security management standard governing IT security controls.</w:t>
             </w:r>
           </w:p>
         </w:tc>
@@ -3141,7 +3111,7 @@
           </w:tcPr>
           <w:p>
             <w:r>
-              <w:t>Information Security team responsible for evaluating and approving IT architecture decisions from a security and compliance perspective.</w:t>
+              <w:t>Information Security team responsible for evaluating and approving IT architecture decisions.</w:t>
             </w:r>
           </w:p>
         </w:tc>
@@ -3258,9 +3228,6 @@
         <w:pStyle w:val="Heading1"/>
       </w:pPr>
       <w:r>
-        <w:rPr>
-          <w:color w:val="1F3864"/>
-        </w:rPr>
         <w:t>10. Contact List</w:t>
       </w:r>
     </w:p>
@@ -3689,9 +3656,6 @@
         <w:pStyle w:val="Heading1"/>
       </w:pPr>
       <w:r>
-        <w:rPr>
-          <w:color w:val="1F3864"/>
-        </w:rPr>
         <w:t>11. Approvals</w:t>
       </w:r>
     </w:p>
@@ -4242,6 +4206,52 @@
           <w:p>
             <w:r/>
             <w:r>
+              <w:t>11 Mar 2026</w:t>
+            </w:r>
+          </w:p>
+        </w:tc>
+        <w:tc>
+          <w:tcPr>
+            <w:tcW w:type="dxa" w:w="2351"/>
+          </w:tcPr>
+          <w:p>
+            <w:r/>
+            <w:r>
+              <w:t>Deyuran Moodly</w:t>
+            </w:r>
+          </w:p>
+        </w:tc>
+        <w:tc>
+          <w:tcPr>
+            <w:tcW w:type="dxa" w:w="2351"/>
+          </w:tcPr>
+          <w:p>
+            <w:r/>
+            <w:r>
+              <w:t>Diagram titles updated to Aurum branding</w:t>
+            </w:r>
+          </w:p>
+        </w:tc>
+      </w:tr>
+      <w:tr>
+        <w:tc>
+          <w:tcPr>
+            <w:tcW w:type="dxa" w:w="2351"/>
+          </w:tcPr>
+          <w:p>
+            <w:r/>
+            <w:r>
+              <w:t>1.2</w:t>
+            </w:r>
+          </w:p>
+        </w:tc>
+        <w:tc>
+          <w:tcPr>
+            <w:tcW w:type="dxa" w:w="2351"/>
+          </w:tcPr>
+          <w:p>
+            <w:r/>
+            <w:r>
               <w:t>TBD</w:t>
             </w:r>
           </w:p>

</xml_diff>